<commit_message>
feat(agreement): execution date in the opening line (legal ordinal style, defaults to today)
Co-Authored-By: Claude Fable 5 <noreply@anthropic.com>
</commit_message>
<xml_diff>
--- a/src/templates/agreement.docx
+++ b/src/templates/agreement.docx
@@ -86,7 +86,13 @@
         <w:rPr>
           <w:u w:val="single"/>
         </w:rPr>
-        <w:tab/>
+        <w:t xml:space="preserve">{Agreement Date}</w:t>
+      </w:r>
+      <w:r>
+        <w:rPr>
+          <w:spacing w:val="-1"/>
+        </w:rPr>
+        <w:t xml:space="preserve"> </w:t>
       </w:r>
       <w:r>
         <w:t>at</w:t>

</xml_diff>